<commit_message>
feat(contrato): blancos __________ en datos a completar (cliente, fechas, montos)
</commit_message>
<xml_diff>
--- a/docs/contrato-modoops.docx
+++ b/docs/contrato-modoops.docx
@@ -30,7 +30,7 @@
         <w:rPr>
           <w:b w:val="0"/>
         </w:rPr>
-        <w:t>En Alta Gracia, Córdoba, a los ___ de ___ de 2026, entre:</w:t>
+        <w:t>En Alta Gracia, Córdoba, a los __________ de __________ de 2026, entre:</w:t>
       </w:r>
     </w:p>
     <w:p>
@@ -70,7 +70,7 @@
         <w:rPr>
           <w:b w:val="0"/>
         </w:rPr>
-        <w:t xml:space="preserve"> [Nombre / Razón Social], [DNI/CUIT], domicilio [___], email [___], tel [___], representante [___], en adelante </w:t>
+        <w:t xml:space="preserve"> Nombre / Razón Social: __________, DNI/CUIT: __________, domicilio: __________, email: __________, tel: __________, representante: __________, en adelante </w:t>
       </w:r>
       <w:r>
         <w:rPr>
@@ -1090,7 +1090,7 @@
         <w:rPr>
           <w:b w:val="0"/>
         </w:rPr>
-        <w:t>Va firmado con el contrato – Cliente: [___] Fecha: [___] – Propuesta válida 20 días hasta [___]Espacio de trabajo: modoops_[cliente] – Infra: [propia / central ModoOps]</w:t>
+        <w:t>Va firmado con el contrato – Cliente: __________ Fecha: __________ – Propuesta válida 20 días hasta __________Espacio de trabajo: modoops_[cliente] – Infra: [propia / central ModoOps]</w:t>
       </w:r>
     </w:p>
     <w:p>
@@ -1112,7 +1112,7 @@
         <w:rPr>
           <w:b w:val="0"/>
         </w:rPr>
-        <w:t>Mostrador (POS) – hasta 2 cajas, 1 sucursal: [dirección]</w:t>
+        <w:t>Mostrador (POS) – hasta 2 cajas, 1 sucursal: __________</w:t>
       </w:r>
     </w:p>
     <w:p>
@@ -1123,7 +1123,7 @@
         <w:rPr>
           <w:b w:val="0"/>
         </w:rPr>
-        <w:t>Depósito Inteligente (Stock) – 1 almacén: [nombre]</w:t>
+        <w:t>Depósito Inteligente (Stock) – 1 almacén: __________</w:t>
       </w:r>
     </w:p>
     <w:p>
@@ -1178,7 +1178,7 @@
         <w:rPr>
           <w:b w:val="0"/>
         </w:rPr>
-        <w:t>Odoo CE – versión acordada: [___]</w:t>
+        <w:t>Odoo CE – versión acordada: __________</w:t>
       </w:r>
     </w:p>
     <w:p>
@@ -1189,7 +1189,7 @@
         <w:rPr>
           <w:b w:val="0"/>
         </w:rPr>
-        <w:t>Ajustes específicos acordados: [___]</w:t>
+        <w:t>Ajustes específicos acordados: __________</w:t>
       </w:r>
     </w:p>
     <w:p>
@@ -1211,7 +1211,7 @@
         <w:rPr>
           <w:b w:val="0"/>
         </w:rPr>
-        <w:t>Cajas: [1/2] – IDs: [___]</w:t>
+        <w:t>Cajas: [1/2] – IDs: __________</w:t>
       </w:r>
     </w:p>
     <w:p>
@@ -1222,7 +1222,7 @@
         <w:rPr>
           <w:b w:val="0"/>
         </w:rPr>
-        <w:t>Usuarios base: hasta 5 – perfiles: [dueño, cajero, depósito]</w:t>
+        <w:t>Usuarios base: hasta 5 – perfiles: __________</w:t>
       </w:r>
     </w:p>
     <w:p>
@@ -1233,7 +1233,7 @@
         <w:rPr>
           <w:b w:val="0"/>
         </w:rPr>
-        <w:t>Lista precios venta: 1 + promos simples: [___]</w:t>
+        <w:t>Lista precios venta: 1 + promos simples: __________</w:t>
       </w:r>
     </w:p>
     <w:p>
@@ -1244,7 +1244,7 @@
         <w:rPr>
           <w:b w:val="0"/>
         </w:rPr>
-        <w:t>Catálogo: carga manual [piloto ___ ítems] / Migración Add-on $150 hasta 500 ítems [SI/NO]</w:t>
+        <w:t>Catálogo: carga manual (piloto: __________) / Migración Add-on $150 hasta 500 ítems [SI/NO]</w:t>
       </w:r>
     </w:p>
     <w:p>
@@ -1255,7 +1255,7 @@
         <w:rPr>
           <w:b w:val="0"/>
         </w:rPr>
-        <w:t>Variantes: hasta 2 atributos: [___]</w:t>
+        <w:t>Variantes: hasta 2 atributos: __________</w:t>
       </w:r>
     </w:p>
     <w:p>
@@ -1277,7 +1277,7 @@
         <w:rPr>
           <w:b w:val="0"/>
         </w:rPr>
-        <w:t>Capacitación: 6h incluidas – modalidad [presencial/remota] fecha [___]</w:t>
+        <w:t>Capacitación: 6h incluidas – modalidad [presencial/remota] fecha __________</w:t>
       </w:r>
     </w:p>
     <w:p>
@@ -1337,7 +1337,7 @@
         <w:rPr>
           <w:b w:val="0"/>
         </w:rPr>
-        <w:t>Fecha objetivo: [___]</w:t>
+        <w:t>Fecha objetivo: __________</w:t>
       </w:r>
     </w:p>
     <w:tbl>
@@ -1511,7 +1511,7 @@
         <w:rPr>
           <w:b w:val="0"/>
         </w:rPr>
-        <w:t>Fecha objetivo: [___]</w:t>
+        <w:t>Fecha objetivo: __________</w:t>
       </w:r>
     </w:p>
     <w:tbl>
@@ -1629,7 +1629,7 @@
           </w:tcPr>
           <w:p>
             <w:r>
-              <w:t>Capacitación 6h dictada [fecha/horas] o plan remanente firmado</w:t>
+              <w:t>Capacitación 6h dictada __________ o plan remanente firmado</w:t>
             </w:r>
           </w:p>
         </w:tc>
@@ -1673,7 +1673,7 @@
           </w:tcPr>
           <w:p>
             <w:r>
-              <w:t>Inicio hipercare 10 días hábiles desde [___] hasta [___]</w:t>
+              <w:t>Inicio hipercare 10 días hábiles desde __________ hasta __________</w:t>
             </w:r>
           </w:p>
         </w:tc>
@@ -1710,13 +1710,13 @@
         <w:rPr>
           <w:b w:val="0"/>
         </w:rPr>
-        <w:t>En [___], a los [___], MODOOPS y [CLIENTE] dejan constancia:</w:t>
+        <w:t>En __________, a los __________, MODOOPS y __________ dejan constancia:</w:t>
         <w:br/>
-        <w:t>1. Hito 1 cumplido según checklist A4. Fallas menores pendientes (si no hay, "ninguna"): [___]</w:t>
+        <w:t>1. Hito 1 cumplido según checklist A4. Fallas menores pendientes (si no hay, "ninguna"): __________</w:t>
         <w:br/>
         <w:t>2. Con esta firma EL CLIENTE acepta el núcleo en staging.</w:t>
         <w:br/>
-        <w:t xml:space="preserve">3. Se habilita facturación del 25%: [$200 USD – ARS equiv. TC ___], a cuenta Alias </w:t>
+        <w:t xml:space="preserve">3. Se habilita facturación del 25%: [$200 USD – ARS equiv. TC __________], a cuenta Alias </w:t>
       </w:r>
       <w:r>
         <w:rPr>
@@ -1740,7 +1740,7 @@
         <w:rPr>
           <w:b w:val="0"/>
         </w:rPr>
-        <w:t>, contra Factura C N° [___].</w:t>
+        <w:t>, contra Factura C N° __________.</w:t>
         <w:br/>
         <w:t>4. Todo destrabe requiere firma (v2: sin silencio=aceptación).</w:t>
       </w:r>
@@ -1788,13 +1788,13 @@
         <w:rPr>
           <w:b w:val="0"/>
         </w:rPr>
-        <w:t>En [___], a los [___], MODOOPS y [CLIENTE] dejan constancia:</w:t>
+        <w:t>En __________, a los __________, MODOOPS y __________ dejan constancia:</w:t>
         <w:br/>
-        <w:t>1. Hito 2 cumplido según checklist A5. Fallas menores pendientes (si no hay, "ninguna"): [___]</w:t>
+        <w:t>1. Hito 2 cumplido según checklist A5. Fallas menores pendientes (si no hay, "ninguna"): __________</w:t>
         <w:br/>
-        <w:t>2. Con esta firma EL CLIENTE acepta el sistema en producción e inicia hipercare hasta [fecha 10 días hábiles].</w:t>
+        <w:t>2. Con esta firma EL CLIENTE acepta el sistema en producción e inicia hipercare hasta __________.</w:t>
         <w:br/>
-        <w:t xml:space="preserve">3. Se habilita facturación del 25% final: [$200 USD – ARS equiv. TC ___], a cuenta Alias </w:t>
+        <w:t xml:space="preserve">3. Se habilita facturación del 25% final: [$200 USD – ARS equiv. TC __________], a cuenta Alias </w:t>
       </w:r>
       <w:r>
         <w:rPr>
@@ -1818,11 +1818,11 @@
         <w:rPr>
           <w:b w:val="0"/>
         </w:rPr>
-        <w:t>, contra Factura C N° [___].</w:t>
+        <w:t>, contra Factura C N° __________.</w:t>
         <w:br/>
-        <w:t>4. Desde [mes siguiente] rige mes de acompañamiento, desde [mes+2] abono mensual $50 USD con vencimiento 1 al 10 según cláusula 9.</w:t>
+        <w:t>4. Desde __________ rige mes de acompañamiento, desde __________ abono mensual $50 USD con vencimiento 1 al 10 según cláusula 9.</w:t>
         <w:br/>
-        <w:t>5. Pendientes fuera de alcance: [___] se presupuestan aparte, no frenan pago.</w:t>
+        <w:t>5. Pendientes fuera de alcance: __________ se presupuestan aparte, no frenan pago.</w:t>
         <w:br/>
         <w:t>6. Todo destrabe requiere firma (v2: sin silencio=aceptación).</w:t>
       </w:r>

</xml_diff>

<commit_message>
feat(contrato): v3 LOCADOR/LOCATARIO + 9.9 tarifa + Anexo B + contexto
</commit_message>
<xml_diff>
--- a/docs/contrato-modoops.docx
+++ b/docs/contrato-modoops.docx
@@ -22,7 +22,7 @@
         <w:rPr>
           <w:b w:val="0"/>
         </w:rPr>
-        <w:t>Contrato de servicios – Implementación + mantenimiento · v2 (07/09/2026)</w:t>
+        <w:t>Contrato de servicios – Implementación + mantenimiento · v3 (08/09/2026)</w:t>
       </w:r>
     </w:p>
     <w:p>
@@ -30,7 +30,7 @@
         <w:rPr>
           <w:b w:val="0"/>
         </w:rPr>
-        <w:t>En Alta Gracia, Córdoba, a los __________ de __________ de 2026, entre:</w:t>
+        <w:t>En Alta Gracia, Córdoba, a los [________] días del mes de [________] de 2026, entre:</w:t>
       </w:r>
     </w:p>
     <w:p>
@@ -38,25 +38,13 @@
         <w:rPr>
           <w:b/>
         </w:rPr>
-        <w:t>EL PRESTADOR:</w:t>
+        <w:t>EL LOCADOR:</w:t>
       </w:r>
       <w:r>
         <w:rPr>
           <w:b w:val="0"/>
         </w:rPr>
-        <w:t xml:space="preserve"> MATASINI Mauricio Nahuel, DNI 36.119.160, CUIT 23-36119160-9, Monotributista prestador de servicios inscripto en ARCA, domicilio Uruguay 1660, Alta Gracia, Córdoba, Cel 3547532008, email mauriciomatasini27@gmail.com, en adelante </w:t>
-      </w:r>
-      <w:r>
-        <w:rPr>
-          <w:b/>
-        </w:rPr>
-        <w:t>MODOOPS</w:t>
-      </w:r>
-      <w:r>
-        <w:rPr>
-          <w:b w:val="0"/>
-        </w:rPr>
-        <w:t>.</w:t>
+        <w:t xml:space="preserve"> MATASINI Mauricio Nahuel, DNI 36.119.160, CUIT 23-36119160-9, Monotributista prestador de servicios inscripto en ARCA, domicilio Uruguay 1660, Alta Gracia, Córdoba, Cel 3547532008, email mauriciomatasini27@gmail.com, en adelante EL LOCADOR.</w:t>
       </w:r>
     </w:p>
     <w:p>
@@ -64,25 +52,13 @@
         <w:rPr>
           <w:b/>
         </w:rPr>
-        <w:t>EL CLIENTE:</w:t>
+        <w:t>EL LOCATARIO:</w:t>
       </w:r>
       <w:r>
         <w:rPr>
           <w:b w:val="0"/>
         </w:rPr>
-        <w:t xml:space="preserve"> Nombre / Razón Social: __________, DNI/CUIT: __________, domicilio: __________, email: __________, tel: __________, representante: __________, en adelante </w:t>
-      </w:r>
-      <w:r>
-        <w:rPr>
-          <w:b/>
-        </w:rPr>
-        <w:t>EL CLIENTE</w:t>
-      </w:r>
-      <w:r>
-        <w:rPr>
-          <w:b w:val="0"/>
-        </w:rPr>
-        <w:t>.</w:t>
+        <w:t xml:space="preserve"> Nombre / Razón Social: [________], DNI/CUIT: [________], domicilio: [________], email: [________], tel: [________], representante: [________], en adelante EL LOCATARIO.</w:t>
       </w:r>
     </w:p>
     <w:p>
@@ -90,19 +66,7 @@
         <w:rPr>
           <w:b w:val="0"/>
         </w:rPr>
-        <w:t xml:space="preserve">Cada parte constituye </w:t>
-      </w:r>
-      <w:r>
-        <w:rPr>
-          <w:b/>
-        </w:rPr>
-        <w:t>domicilio electrónico</w:t>
-      </w:r>
-      <w:r>
-        <w:rPr>
-          <w:b w:val="0"/>
-        </w:rPr>
-        <w:t xml:space="preserve"> en el email del encabezado. Los avisos a esos emails valen como notificación.</w:t>
+        <w:t>Cada parte constituye domicilio electrónico en el email del encabezado. Los avisos a esos emails valen como notificación fehaciente.</w:t>
       </w:r>
     </w:p>
     <w:p>
@@ -135,7 +99,7 @@
         <w:rPr>
           <w:b w:val="0"/>
         </w:rPr>
-        <w:t>1.2. Go-live (puesta en producción: prender el sistema en tu local, una incluida) + hipercare (10 días hábiles para arreglar fallas de lo incluido, gratis) + capacitación.</w:t>
+        <w:t>1.2. Go-live (puesta en producción: encender el sistema en el establecimiento del LOCATARIO, una puesta incluida) + hipercare (10 días hábiles para arreglar fallas de lo incluido, gratis) + capacitación.</w:t>
       </w:r>
     </w:p>
     <w:p>
@@ -157,7 +121,7 @@
         <w:rPr>
           <w:b w:val="0"/>
         </w:rPr>
-        <w:t>1.4. Contrato entre independientes. No hay relación de dependencia (Ley 20.744).</w:t>
+        <w:t>1.4. Contrato entre independientes. No existe relación de dependencia laboral (Ley 20.744).</w:t>
       </w:r>
     </w:p>
     <w:p>
@@ -168,7 +132,7 @@
         <w:rPr>
           <w:b w:val="0"/>
         </w:rPr>
-        <w:t>2. DEFINICIONES (hablamos el mismo idioma)</w:t>
+        <w:t>2. DEFINICIONES (Terminología acordada)</w:t>
       </w:r>
     </w:p>
     <w:p>
@@ -202,19 +166,7 @@
         <w:rPr>
           <w:b w:val="0"/>
         </w:rPr>
-        <w:t xml:space="preserve"> aceptación formal </w:t>
-      </w:r>
-      <w:r>
-        <w:rPr>
-          <w:b/>
-        </w:rPr>
-        <w:t>con acta firmada</w:t>
-      </w:r>
-      <w:r>
-        <w:rPr>
-          <w:b w:val="0"/>
-        </w:rPr>
-        <w:t xml:space="preserve"> que destraba un pago. Sin firma no hay pago.</w:t>
+        <w:t xml:space="preserve"> aceptación formal con acta firmada que destraba un pago. Sin firma no hay pago.</w:t>
       </w:r>
     </w:p>
     <w:p>
@@ -231,7 +183,7 @@
         <w:rPr>
           <w:b w:val="0"/>
         </w:rPr>
-        <w:t xml:space="preserve"> prender el sistema en tu local. Una puesta incluida.</w:t>
+        <w:t xml:space="preserve"> encender el sistema en el establecimiento del LOCATARIO. Una puesta incluida.</w:t>
       </w:r>
     </w:p>
     <w:p>
@@ -248,7 +200,7 @@
         <w:rPr>
           <w:b w:val="0"/>
         </w:rPr>
-        <w:t xml:space="preserve"> solo bugs de alta/media sin workaround del alcance aceptado.</w:t>
+        <w:t xml:space="preserve"> solo bugs de gravedad alta/media sin workaround del alcance aceptado.</w:t>
       </w:r>
     </w:p>
     <w:p>
@@ -299,7 +251,7 @@
         <w:rPr>
           <w:b w:val="0"/>
         </w:rPr>
-        <w:t xml:space="preserve"> todo lo fuera de alcance. Se cotiza y requiere tu aprobación escrita previa.</w:t>
+        <w:t xml:space="preserve"> todo lo fuera de alcance. Se cotiza y requiere la aprobación escrita previa del LOCATARIO.</w:t>
       </w:r>
     </w:p>
     <w:p>
@@ -400,7 +352,7 @@
         <w:rPr>
           <w:b w:val="0"/>
         </w:rPr>
-        <w:t>3.2. Excluido salvo Add-on con precio escrito: CRM, web/eCommerce, MRP, multi-sucursal/almacén, B2B avanzado, integraciones externas, migración histórica, fiscal fuera de estándar.</w:t>
+        <w:t>3.2. Queda excluido salvo Add-on con precio escrito: CRM, web/eCommerce, MRP, multi-sucursal/almacén, B2B avanzado, integraciones externas, migración histórica, fiscal fuera de estándar.</w:t>
       </w:r>
     </w:p>
     <w:p>
@@ -411,7 +363,7 @@
         <w:rPr>
           <w:b w:val="0"/>
         </w:rPr>
-        <w:t>3.3. El precio fijo es por alcance, no por horas ilimitadas. Superadas las 8h de ajustes, o pedido fuera de lista = Cambio/Add-on con presupuesto previo escrito.</w:t>
+        <w:t>3.3. El precio fijo es por alcance, no por horas ilimitadas. Superadas las 8h de ajustes, o un pedido fuera de lista = Cambio/Add-on con presupuesto previo escrito.</w:t>
       </w:r>
     </w:p>
     <w:p>
@@ -422,13 +374,7 @@
         <w:rPr>
           <w:b w:val="0"/>
         </w:rPr>
-        <w:t xml:space="preserve">3.4. Hito 1 (núcleo en staging) destraba 25% contra acta Hito 1 firmada. Hito 2 (producción) destraba 25% final contra acta Hito 2 firmada. </w:t>
-      </w:r>
-      <w:r>
-        <w:rPr>
-          <w:b/>
-        </w:rPr>
-        <w:t>Todo destrabe requiere firma.</w:t>
+        <w:t>3.4. Hito 1 (núcleo en staging) destraba el 25% contra acta Hito 1 firmada. Hito 2 (producción) destraba el 25% final contra acta Hito 2 firmada. Todo destrabe requiere firma.</w:t>
       </w:r>
     </w:p>
     <w:p>
@@ -439,7 +385,7 @@
         <w:rPr>
           <w:b w:val="0"/>
         </w:rPr>
-        <w:t>4. FACTURACIÓN ELECTRÓNICA – ANEXO B</w:t>
+        <w:t>4. FACTURACIÓN ELECTRÓNICA</w:t>
       </w:r>
     </w:p>
     <w:p>
@@ -450,19 +396,18 @@
         <w:rPr>
           <w:b w:val="0"/>
         </w:rPr>
-        <w:t xml:space="preserve">4.1. El ancla no promete comprobantes salvo la lista explícita del </w:t>
+        <w:t>4.1. El ancla no promete comprobantes salvo la lista explícita del Anexo A, que se cierra durante la implementación antes del go-live.</w:t>
       </w:r>
-      <w:r>
-        <w:rPr>
-          <w:b/>
-        </w:rPr>
-        <w:t>Anexo B</w:t>
-      </w:r>
+    </w:p>
+    <w:p>
+      <w:pPr>
+        <w:pStyle w:val="ListBullet"/>
+      </w:pPr>
       <w:r>
         <w:rPr>
           <w:b w:val="0"/>
         </w:rPr>
-        <w:t>, que se cierra durante la implementación con tu contador y tu firma, antes del go-live.</w:t>
+        <w:t>4.2. Sin Anexo A firmado y prueba en staging, no hay puesta en producción ni emisión real.</w:t>
       </w:r>
     </w:p>
     <w:p>
@@ -473,7 +418,7 @@
         <w:rPr>
           <w:b w:val="0"/>
         </w:rPr>
-        <w:t>4.2. Sin Anexo B firmado + prueba en staging no hay puesta en producción ni emisión real.</w:t>
+        <w:t>4.3. Los certificados y puntos de venta de prueba deben ser provistos por EL LOCATARIO (o su contador). Si la validación se demora, la fecha se reprograma sin penalidad.</w:t>
       </w:r>
     </w:p>
     <w:p>
@@ -484,7 +429,7 @@
         <w:rPr>
           <w:b w:val="0"/>
         </w:rPr>
-        <w:t>4.3. Certificados y puntos de venta de prueba los proveés vos (o tu contador). Si la validación se demora, la fecha se reprograma sin penalidad.</w:t>
+        <w:t>4.4. Ventana de coordinación fiscal incluida: 2 semanas hábiles desde el Hito 1. Después, el seguimiento por demora atribuible al LOCATARIO se cotiza.</w:t>
       </w:r>
     </w:p>
     <w:p>
@@ -495,18 +440,7 @@
         <w:rPr>
           <w:b w:val="0"/>
         </w:rPr>
-        <w:t>4.4. Ventana de coordinación fiscal incluida: 2 semanas hábiles desde el Hito 1. Después, el seguimiento por demora atribuible al cliente se cotiza.</w:t>
-      </w:r>
-    </w:p>
-    <w:p>
-      <w:pPr>
-        <w:pStyle w:val="ListBullet"/>
-      </w:pPr>
-      <w:r>
-        <w:rPr>
-          <w:b w:val="0"/>
-        </w:rPr>
-        <w:t>4.5. Devoluciones y notas de crédito quedan fuera del ancla salvo lista explícita en el Anexo B.</w:t>
+        <w:t>4.5. Devoluciones y notas de crédito quedan fuera del ancla salvo lista explícita en el Anexo A.</w:t>
       </w:r>
     </w:p>
     <w:p>
@@ -528,42 +462,18 @@
         <w:rPr>
           <w:b w:val="0"/>
         </w:rPr>
-        <w:t xml:space="preserve">5.1. Precio fijo total: </w:t>
+        <w:t>5.1. Precio fijo total: $800 USD (ancla). Propuesta válida por 20 días.</w:t>
       </w:r>
-      <w:r>
-        <w:rPr>
-          <w:b/>
-        </w:rPr>
-        <w:t>$800 USD</w:t>
-      </w:r>
+    </w:p>
+    <w:p>
+      <w:pPr>
+        <w:pStyle w:val="ListBullet"/>
+      </w:pPr>
       <w:r>
         <w:rPr>
           <w:b w:val="0"/>
         </w:rPr>
-        <w:t xml:space="preserve"> (ancla). Propuesta válida 20 días.</w:t>
-      </w:r>
-    </w:p>
-    <w:p>
-      <w:pPr>
-        <w:pStyle w:val="ListBullet"/>
-      </w:pPr>
-      <w:r>
-        <w:rPr>
-          <w:b w:val="0"/>
-        </w:rPr>
-        <w:t xml:space="preserve">5.2. 50% anticipo ($400 USD) para iniciar. </w:t>
-      </w:r>
-      <w:r>
-        <w:rPr>
-          <w:b/>
-        </w:rPr>
-        <w:t>El alta de trabajo se confirma con tu transferencia del 50%</w:t>
-      </w:r>
-      <w:r>
-        <w:rPr>
-          <w:b w:val="0"/>
-        </w:rPr>
-        <w:t>: reserva fecha e inicia el plazo. Sin acreditación no corre plazo.</w:t>
+        <w:t>5.2. 50% de anticipo ($400 USD) para iniciar. El alta de trabajo se confirma con la transferencia del 50%: reserva de fecha e inicio del plazo. Sin acreditación no corre plazo.</w:t>
       </w:r>
     </w:p>
     <w:p>
@@ -596,7 +506,7 @@
         <w:rPr>
           <w:b w:val="0"/>
         </w:rPr>
-        <w:t>5.5. Moneda USD. Si pedís ARS: tipo de cambio del día de la factura (se escribe en la factura). Solo una moneda por factura.</w:t>
+        <w:t>5.5. Moneda de pago: USD. Si EL LOCATARIO solicita el pago en ARS, se aplicará el tipo de cambio [ESPECIFICAR: ej. Dólar MEP / BNA Vendedor] del día de emisión de la factura (se detallará en la misma). Solo una moneda por factura.</w:t>
       </w:r>
     </w:p>
     <w:p>
@@ -607,30 +517,18 @@
         <w:rPr>
           <w:b w:val="0"/>
         </w:rPr>
-        <w:t xml:space="preserve">5.6. Recargo por demora: </w:t>
+        <w:t>5.6. Recargo por demora: 0,17% diario (≈5% mensual) sobre el monto vencido, computado desde el vencimiento hasta el efectivo pago. Sin capitalización.</w:t>
       </w:r>
-      <w:r>
-        <w:rPr>
-          <w:b/>
-        </w:rPr>
-        <w:t>0,17% diario (≈5% mensual)</w:t>
-      </w:r>
+    </w:p>
+    <w:p>
+      <w:pPr>
+        <w:pStyle w:val="ListBullet"/>
+      </w:pPr>
       <w:r>
         <w:rPr>
           <w:b w:val="0"/>
         </w:rPr>
-        <w:t xml:space="preserve"> sobre el monto vencido, desde el vencimiento hasta el pago. Sin capitalización.</w:t>
-      </w:r>
-    </w:p>
-    <w:p>
-      <w:pPr>
-        <w:pStyle w:val="ListBullet"/>
-      </w:pPr>
-      <w:r>
-        <w:rPr>
-          <w:b w:val="0"/>
-        </w:rPr>
-        <w:t xml:space="preserve">5.7. Pago por transferencia a cuenta dólares Mercado Pago – Banco Industrial BIND: Alias </w:t>
+        <w:t xml:space="preserve">5.7. Pago mediante transferencia a cuenta en dólares Mercado Pago – Banco Industrial BIND: Alias </w:t>
       </w:r>
       <w:r>
         <w:rPr>
@@ -662,7 +560,7 @@
         <w:rPr>
           <w:b/>
         </w:rPr>
-        <w:t>⚠ Sin tu transferencia del 50% no hay fecha reservada ni plazo corriendo. Cada pago se destraba solo con acta firmada.</w:t>
+        <w:t>⚠ AVISO: Sin la transferencia del anticipo del 50% no hay fecha reservada ni plazo corriendo. Cada pago se destraba únicamente con acta firmada.</w:t>
       </w:r>
     </w:p>
     <w:p>
@@ -673,7 +571,7 @@
         <w:rPr>
           <w:b w:val="0"/>
         </w:rPr>
-        <w:t>6. OBLIGACIONES DEL CLIENTE</w:t>
+        <w:t>6. OBLIGACIONES DEL LOCATARIO</w:t>
       </w:r>
     </w:p>
     <w:p>
@@ -681,7 +579,7 @@
         <w:rPr>
           <w:b w:val="0"/>
         </w:rPr>
-        <w:t>Proveer accesos, internet, PC/cajas, datos en plantilla, tiempo para capacitación y a tu contador a tiempo para el Anexo B. Si no entregás, el plazo se desplaza sin penalidad para el prestador. Plazo máximo de implementación: 3 semanas desde el anticipo + entrega de accesos.</w:t>
+        <w:t>Proveer accesos, internet, PC/cajas, datos en plantilla, tiempo para capacitación y la disponibilidad de su contador a tiempo para el Anexo B. Si EL LOCATARIO no realiza las entregas pertinentes, el plazo se desplaza sin penalidad para EL LOCADOR. Plazo máximo de implementación: 3 semanas a contar desde el pago del anticipo y la entrega de accesos.</w:t>
       </w:r>
     </w:p>
     <w:p>
@@ -700,7 +598,7 @@
         <w:rPr>
           <w:b w:val="0"/>
         </w:rPr>
-        <w:t>Hora adicional $12 USD/h. Día $55 USD. Módulo fuera del ancla $150 USD. Refs.: Migración catálogo hasta 500 ítems $150 USD, B2B básico $150 USD, integración desde $110 USD (mín. 2 días). Todo con tu aprobación escrita previa. Nada se hace "de palabra".</w:t>
+        <w:t>Hora adicional $12 USD/h. Día $55 USD. Módulo fuera del ancla $150 USD. Referencias: Migración de catálogo hasta 500 ítems $150 USD, B2B básico $150 USD, integración desde $110 USD (mín. 2 días). Todo sujeto a aprobación escrita previa del LOCATARIO. No se admiten modificaciones "de palabra".</w:t>
       </w:r>
     </w:p>
     <w:p>
@@ -719,7 +617,7 @@
         <w:rPr>
           <w:b w:val="0"/>
         </w:rPr>
-        <w:t>10 días hábiles post go-live: se corrigen sin costo solo fallas de lo incluido en el Anexo A (alta/media sin workaround). No cubre mal uso, datos cargados por vos, tu internet/equipos, servicios de terceros ni lo expresamente excluido. Después del hipercare, solo con abono.</w:t>
+        <w:t>Durante 10 días hábiles post go-live: se corregirán sin costo únicamente fallas de los ítems incluidos en el Anexo A (gravedad alta/media sin workaround). Esta garantía no cubre mal uso, datos cargados por EL LOCATARIO, fallas en la conexión a internet o equipos del LOCATARIO, servicios de terceros, ni lo expresamente excluido en este contrato. Finalizado el hipercare, el soporte se regirá solo mediante abono.</w:t>
       </w:r>
     </w:p>
     <w:p>
@@ -752,19 +650,18 @@
         <w:rPr>
           <w:b w:val="0"/>
         </w:rPr>
-        <w:t xml:space="preserve">9.2. Desde mes 2: Abono </w:t>
+        <w:t>9.2. Desde el mes 2: Abono $50 USD/mes que incluye 4h/mes + best effort en bugs. Las horas no utilizadas vencen en el mes (no son acumulables). Los cambios adicionales se cotizan.</w:t>
       </w:r>
-      <w:r>
-        <w:rPr>
-          <w:b/>
-        </w:rPr>
-        <w:t>$50 USD/mes</w:t>
-      </w:r>
+    </w:p>
+    <w:p>
+      <w:pPr>
+        <w:pStyle w:val="ListBullet"/>
+      </w:pPr>
       <w:r>
         <w:rPr>
           <w:b w:val="0"/>
         </w:rPr>
-        <w:t xml:space="preserve"> con 4h/mes + best effort en bugs. Las horas no usadas vencen (no acumulan). Cambios se cotizan.</w:t>
+        <w:t>9.3. Vencimiento del 1 al 10 de cada mes. Se emite Factura C el día 1.</w:t>
       </w:r>
     </w:p>
     <w:p>
@@ -775,7 +672,7 @@
         <w:rPr>
           <w:b w:val="0"/>
         </w:rPr>
-        <w:t>9.3. Vence del 1 al 10. Factura C el día 1.</w:t>
+        <w:t>9.4. Vencido el día 10: se enviará aviso por WhatsApp y email detallando el monto más el recargo (0,17% diario).</w:t>
       </w:r>
     </w:p>
     <w:p>
@@ -786,7 +683,7 @@
         <w:rPr>
           <w:b w:val="0"/>
         </w:rPr>
-        <w:t>9.4. Vencido el 10: aviso por WhatsApp + email con monto + recargo (0,17% diario).</w:t>
+        <w:t>9.5. Se otorgan 7 días corridos de gracia desde el aviso. Ante la falta de pago: se suspende el servicio (solo lectura, sin borrado de datos, IA bloqueada).</w:t>
       </w:r>
     </w:p>
     <w:p>
@@ -797,7 +694,7 @@
         <w:rPr>
           <w:b w:val="0"/>
         </w:rPr>
-        <w:t>9.5. 7 días corridos de gracia desde el aviso. Sin pago: se suspende (solo lectura, sin borrado, IA bloqueada).</w:t>
+        <w:t>9.6. Abonando el capital + recargo → rehabilitación del servicio dentro de la jornada.</w:t>
       </w:r>
     </w:p>
     <w:p>
@@ -808,19 +705,18 @@
         <w:rPr>
           <w:b w:val="0"/>
         </w:rPr>
-        <w:t xml:space="preserve">9.6. Pagás + recargo → rehabilitación </w:t>
+        <w:t>9.7. A los 15 días corridos de suspensión: se realiza backup final y baja del servicio. El mes suspendido no se cobra. Costo de re-alta = $55 USD.</w:t>
       </w:r>
-      <w:r>
-        <w:rPr>
-          <w:b/>
-        </w:rPr>
-        <w:t>dentro de la jornada</w:t>
-      </w:r>
+    </w:p>
+    <w:p>
+      <w:pPr>
+        <w:pStyle w:val="ListBullet"/>
+      </w:pPr>
       <w:r>
         <w:rPr>
           <w:b w:val="0"/>
         </w:rPr>
-        <w:t>.</w:t>
+        <w:t>9.8. Sin abono vigente: no se brindará soporte reactivo, procediendo únicamente mediante trabajos puntuales previamente cotizados.</w:t>
       </w:r>
     </w:p>
     <w:p>
@@ -831,18 +727,7 @@
         <w:rPr>
           <w:b w:val="0"/>
         </w:rPr>
-        <w:t>9.7. A los 15 días corridos suspendido: backup final y baja. El mes suspendido no se cobra. Re-alta = $55 USD.</w:t>
-      </w:r>
-    </w:p>
-    <w:p>
-      <w:pPr>
-        <w:pStyle w:val="ListBullet"/>
-      </w:pPr>
-      <w:r>
-        <w:rPr>
-          <w:b w:val="0"/>
-        </w:rPr>
-        <w:t>9.8. Sin abono: sin soporte reactivo, solo trabajos puntuales cotizados.</w:t>
+        <w:t>9.9. Actualización de tarifa: El valor del abono mensual podrá ser actualizado por EL LOCADOR mediante notificación previa cursada por correo electrónico o WhatsApp con una anticipación mínima de treinta (30) días corridos a su entrada en vigencia. Si EL LOCATARIO no estuviera de acuerdo con el nuevo monto, podrá rescindir el servicio de abono sin penalidad alguna antes de la fecha de aplicación del aumento, de conformidad con la cláusula 13.4.</w:t>
       </w:r>
     </w:p>
     <w:p>
@@ -850,7 +735,7 @@
         <w:rPr>
           <w:b/>
         </w:rPr>
-        <w:t>⚠ Pagá del 1 al 10 y todo sigue. A los 7 días de avisado sin pago se pausa (solo lectura, nada se borra). A los 15 se da de baja con backup.</w:t>
+        <w:t>⚠ AVISO: Abonando del 1 al 10 el servicio continúa con normalidad. A los 7 días de avisado el impago, se pausa el sistema (solo lectura, sin pérdida de datos). A los 15 días se procede a la baja con entrega de backup.</w:t>
       </w:r>
     </w:p>
     <w:p>
@@ -869,7 +754,7 @@
         <w:rPr>
           <w:b w:val="0"/>
         </w:rPr>
-        <w:t>ModoOps, scripts y desarrollos del PRESTADOR siguen siendo del PRESTADOR salvo cesión escrita con pago total. EL CLIENTE recibe licencia de uso intransferible en su espacio de trabajo ModoOps (tenant modoops_[cliente]) mientras esté al día. Componentes de terceros open-source (incluido Odoo CE, versión acordada en Anexo A) se rigen por sus licencias respectivas.</w:t>
+        <w:t>ModoOps, los scripts y desarrollos del LOCADOR siguen siendo propiedad exclusiva del LOCADOR, salvo cesión expresa y escrita con pago total. EL LOCATARIO recibe una licencia de uso intransferible en su espacio de trabajo ModoOps (tenant modoops_[________]) mientras se encuentre al día con los pagos. Los componentes de terceros de código abierto (incluido Odoo CE, en la versión acordada en el Anexo A) se rigen por sus respectivas licencias.</w:t>
       </w:r>
     </w:p>
     <w:p>
@@ -891,7 +776,7 @@
         <w:rPr>
           <w:b w:val="0"/>
         </w:rPr>
-        <w:t>11.1. Confidencialidad 3 años post-contrato.</w:t>
+        <w:t>11.1. Deber de confidencialidad por 3 años posteriores a la finalización del contrato.</w:t>
       </w:r>
     </w:p>
     <w:p>
@@ -902,7 +787,7 @@
         <w:rPr>
           <w:b w:val="0"/>
         </w:rPr>
-        <w:t>11.2. Los datos de tu operación son del CLIENTE: no se venden ni se comparten. Finalidad: operar tu gestión en tu tenant. Responsable: el prestador como encargado de tratamiento.</w:t>
+        <w:t>11.2. Los datos de la operación pertenecen exclusivamente al LOCATARIO: no se venden ni se comparten. Finalidad: operar la gestión en el tenant. Responsabilidad: EL LOCADOR actúa únicamente como encargado de tratamiento.</w:t>
       </w:r>
     </w:p>
     <w:p>
@@ -913,7 +798,7 @@
         <w:rPr>
           <w:b w:val="0"/>
         </w:rPr>
-        <w:t>11.3. Podés pedir acceso, rectificación y supresión de tus datos (derechos ARCO) al email del encabezado. Medidas de seguridad y backup según cláusula 12. Memoria de IA en tu tenant con retención de 90 días.</w:t>
+        <w:t>11.3. EL LOCATARIO podrá ejercer los derechos de acceso, rectificación y supresión de sus datos (derechos ARCO) dirigiendo su solicitud al email del encabezado. Medidas de seguridad y backup según la cláusula 12. La memoria de Inteligencia Artificial en el tenant posee una retención de 90 días.</w:t>
       </w:r>
     </w:p>
     <w:p>
@@ -924,7 +809,7 @@
         <w:rPr>
           <w:b w:val="0"/>
         </w:rPr>
-        <w:t>12. INFRA Y LÍMITE DE RESPONSABILIDAD</w:t>
+        <w:t>12. INFRAESTRUCTURA Y LÍMITE DE RESPONSABILIDAD</w:t>
       </w:r>
     </w:p>
     <w:p>
@@ -932,7 +817,7 @@
         <w:rPr>
           <w:b w:val="0"/>
         </w:rPr>
-        <w:t>Sin garantía de disponibilidad salvo anexo escrito. Si la infra es tuya: diagnosticamos y coordinamos, no reparamos tu hosting. Si es central ModoOps: copia de seguridad diaria. La responsabilidad del prestador se limita a lo pagado del ancla, sin daños indirectos ni lucro cesante, salvo dolo.</w:t>
+        <w:t>No se otorga garantía de disponibilidad salvo anexo escrito. Si la infraestructura pertenece al LOCATARIO: EL LOCADOR diagnosticará y coordinará, pero no reparará el hosting del LOCATARIO. Si se utiliza la central ModoOps: se realizará copia de seguridad diaria. La responsabilidad del LOCADOR se limita al monto abonado por el paquete ancla, excluyéndose daños indirectos o lucro cesante, salvo dolo.</w:t>
       </w:r>
     </w:p>
     <w:p>
@@ -954,7 +839,7 @@
         <w:rPr>
           <w:b w:val="0"/>
         </w:rPr>
-        <w:t>13.1. Plazo máximo: 3 semanas desde el anticipo del 50% + entrega de accesos.</w:t>
+        <w:t>13.1. Plazo máximo de implementación: 3 semanas a partir del pago del anticipo del 50% y la entrega de accesos.</w:t>
       </w:r>
     </w:p>
     <w:p>
@@ -965,7 +850,7 @@
         <w:rPr>
           <w:b w:val="0"/>
         </w:rPr>
-        <w:t>13.2. Si rescindís vos sin causa: pagás el avance ejecutado + hitos aceptados. El anticipo se imputa primero a lo ejecutado y no vuelve lo ya trabajado. Anticipo no iniciado = devolución.</w:t>
+        <w:t>13.2. Si EL LOCATARIO rescinde sin causa: deberá abonar el avance ejecutado y los hitos aceptados. El anticipo se imputará primero a lo ejecutado, sin devolución de lo ya trabajado. En caso de anticipo sin inicio de tareas, procederá su devolución.</w:t>
       </w:r>
     </w:p>
     <w:p>
@@ -976,7 +861,7 @@
         <w:rPr>
           <w:b w:val="0"/>
         </w:rPr>
-        <w:t>13.3. Si rescindimos nosotros sin causa: devolvemos la parte proporcional no ejecutada.</w:t>
+        <w:t>13.3. Si EL LOCADOR rescinde sin causa: devolverá la parte proporcional no ejecutada.</w:t>
       </w:r>
     </w:p>
     <w:p>
@@ -987,7 +872,7 @@
         <w:rPr>
           <w:b w:val="0"/>
         </w:rPr>
-        <w:t>13.4. Abono: se rescinde mes a mes avisando antes del 20.</w:t>
+        <w:t>13.4. Abono de mantenimiento: puede rescindirse mes a mes cursando aviso fehaciente antes del día 20 del mes en curso.</w:t>
       </w:r>
     </w:p>
     <w:p>
@@ -998,7 +883,7 @@
         <w:rPr>
           <w:b w:val="0"/>
         </w:rPr>
-        <w:t>13.5. Incumplimiento grave: reclamo escrito con 10 días hábiles para corregir, luego resolución.</w:t>
+        <w:t>13.5. Incumplimiento grave: requerirá reclamo escrito otorgando 10 días hábiles para subsanar; vencido dicho plazo, procederá la resolución del contrato.</w:t>
       </w:r>
     </w:p>
     <w:p>
@@ -1017,7 +902,7 @@
         <w:rPr>
           <w:b w:val="0"/>
         </w:rPr>
-        <w:t>Tribunales de Alta Gracia, Córdoba. Los domicilios y domicilios electrónicos del encabezado valen como notificación.</w:t>
+        <w:t>Para cualquier controversia, las partes se someten a los Tribunales Ordinarios de la ciudad de Alta Gracia, Provincia de Córdoba. Los domicilios físicos y electrónicos indicados en el encabezado son válidos para cualquier notificación.</w:t>
       </w:r>
     </w:p>
     <w:p>
@@ -1032,11 +917,25 @@
       </w:r>
     </w:p>
     <w:p>
+      <w:pPr>
+        <w:pStyle w:val="ListBullet"/>
+      </w:pPr>
       <w:r>
         <w:rPr>
           <w:b w:val="0"/>
         </w:rPr>
-        <w:t>A Alcance/lista cerrada + checklists y actas (Hito 1 y Hito 2). B Fiscal (comprobantes, se cierra antes del go-live).</w:t>
+        <w:t>A. Alcance / lista cerrada + checklists y actas (Hito 1 y Hito 2).</w:t>
+      </w:r>
+    </w:p>
+    <w:p>
+      <w:pPr>
+        <w:pStyle w:val="ListBullet"/>
+      </w:pPr>
+      <w:r>
+        <w:rPr>
+          <w:b w:val="0"/>
+        </w:rPr>
+        <w:t>B. Fiscal (comprobantes, se cierra antes del go-live).</w:t>
       </w:r>
     </w:p>
     <w:tbl>
@@ -1090,7 +989,7 @@
         <w:rPr>
           <w:b w:val="0"/>
         </w:rPr>
-        <w:t>Va firmado con el contrato – Cliente: __________ Fecha: __________ – Propuesta válida 20 días hasta __________Espacio de trabajo: modoops_[cliente] – Infra: [propia / central ModoOps]</w:t>
+        <w:t>Forma parte integral del contrato firmado – LOCATARIO: [________] Fecha: [________] – Propuesta válida por 20 días hasta el [________]Espacio de trabajo: modoops_[________] – Infraestructura: [propia / central ModoOps]</w:t>
       </w:r>
     </w:p>
     <w:p>
@@ -1112,7 +1011,7 @@
         <w:rPr>
           <w:b w:val="0"/>
         </w:rPr>
-        <w:t>Mostrador (POS) – hasta 2 cajas, 1 sucursal: __________</w:t>
+        <w:t>Mostrador (POS) – hasta 2 cajas, 1 sucursal: [________]</w:t>
       </w:r>
     </w:p>
     <w:p>
@@ -1123,7 +1022,7 @@
         <w:rPr>
           <w:b w:val="0"/>
         </w:rPr>
-        <w:t>Depósito Inteligente (Stock) – 1 almacén: __________</w:t>
+        <w:t>Depósito Inteligente (Stock) – 1 almacén: [________]</w:t>
       </w:r>
     </w:p>
     <w:p>
@@ -1145,7 +1044,7 @@
         <w:rPr>
           <w:b w:val="0"/>
         </w:rPr>
-        <w:t>Facturación electrónica estándar – comprobantes según Anexo B, validados con tu contador</w:t>
+        <w:t>Facturación electrónica estándar – comprobantes según Anexo B, validados con el contador del LOCATARIO</w:t>
       </w:r>
     </w:p>
     <w:p>
@@ -1156,7 +1055,7 @@
         <w:rPr>
           <w:b w:val="0"/>
         </w:rPr>
-        <w:t>Contabilidad operativa ligada a ventas/compras (no cierre mensual del estudio)</w:t>
+        <w:t>Contabilidad operativa ligada a ventas/compras (no incluye el cierre mensual de estudio contable)</w:t>
       </w:r>
     </w:p>
     <w:p>
@@ -1178,7 +1077,7 @@
         <w:rPr>
           <w:b w:val="0"/>
         </w:rPr>
-        <w:t>Odoo CE – versión acordada: __________</w:t>
+        <w:t>Odoo CE – versión acordada: [________]</w:t>
       </w:r>
     </w:p>
     <w:p>
@@ -1189,7 +1088,7 @@
         <w:rPr>
           <w:b w:val="0"/>
         </w:rPr>
-        <w:t>Ajustes específicos acordados: __________</w:t>
+        <w:t>Ajustes específicos acordados: [________]</w:t>
       </w:r>
     </w:p>
     <w:p>
@@ -1211,7 +1110,7 @@
         <w:rPr>
           <w:b w:val="0"/>
         </w:rPr>
-        <w:t>Cajas: [1/2] – IDs: __________</w:t>
+        <w:t>Cajas: [1 / 2] – IDs: [________]</w:t>
       </w:r>
     </w:p>
     <w:p>
@@ -1222,7 +1121,7 @@
         <w:rPr>
           <w:b w:val="0"/>
         </w:rPr>
-        <w:t>Usuarios base: hasta 5 – perfiles: __________</w:t>
+        <w:t>Usuarios base: hasta 5 – perfiles: [________]</w:t>
       </w:r>
     </w:p>
     <w:p>
@@ -1233,7 +1132,7 @@
         <w:rPr>
           <w:b w:val="0"/>
         </w:rPr>
-        <w:t>Lista precios venta: 1 + promos simples: __________</w:t>
+        <w:t>Lista precios venta: 1 + promociones simples: [________]</w:t>
       </w:r>
     </w:p>
     <w:p>
@@ -1244,7 +1143,7 @@
         <w:rPr>
           <w:b w:val="0"/>
         </w:rPr>
-        <w:t>Catálogo: carga manual (piloto: __________) / Migración Add-on $150 hasta 500 ítems [SI/NO]</w:t>
+        <w:t>Catálogo: carga manual (piloto: [________]) / Migración Add-on $150 hasta 500 ítems [SI / NO]</w:t>
       </w:r>
     </w:p>
     <w:p>
@@ -1255,7 +1154,7 @@
         <w:rPr>
           <w:b w:val="0"/>
         </w:rPr>
-        <w:t>Variantes: hasta 2 atributos: __________</w:t>
+        <w:t>Variantes: hasta 2 atributos: [________]</w:t>
       </w:r>
     </w:p>
     <w:p>
@@ -1277,7 +1176,7 @@
         <w:rPr>
           <w:b w:val="0"/>
         </w:rPr>
-        <w:t>Capacitación: 6h incluidas – modalidad [presencial/remota] fecha __________</w:t>
+        <w:t>Capacitación: 6h incluidas – modalidad [presencial / remota] fecha: [________]</w:t>
       </w:r>
     </w:p>
     <w:p>
@@ -1288,7 +1187,7 @@
         <w:rPr>
           <w:b w:val="0"/>
         </w:rPr>
-        <w:t>Infra: [propia / central ModoOps Fase 1]</w:t>
+        <w:t>Infraestructura: [propia / central ModoOps Fase 1]</w:t>
       </w:r>
     </w:p>
     <w:p>
@@ -1310,7 +1209,7 @@
         <w:rPr>
           <w:b w:val="0"/>
         </w:rPr>
-        <w:t>A3. Excluido expreso (= Add-on)</w:t>
+        <w:t>A3. Excluido de forma expresa (= Add-on)</w:t>
       </w:r>
     </w:p>
     <w:p>
@@ -1318,7 +1217,7 @@
         <w:rPr>
           <w:b w:val="0"/>
         </w:rPr>
-        <w:t>CRM, web/eCommerce, MRP, multi-sucursal/almacén, B2B avanzado ($150 USD), integraciones (desde $110 USD, mín. 2 días), histórico años, percepciones/retenciones complejas, multi-moneda, exportaciones.</w:t>
+        <w:t>CRM, web/eCommerce, MRP, multi-sucursal/almacén, B2B avanzado ($150 USD), integraciones (desde $110 USD, mín. 2 días), histórico de años anteriores, percepciones/retenciones complejas, multi-moneda, exportaciones.</w:t>
       </w:r>
     </w:p>
     <w:p>
@@ -1329,7 +1228,7 @@
         <w:rPr>
           <w:b w:val="0"/>
         </w:rPr>
-        <w:t>A4. Hito 1 – Núcleo en staging – destraba 25%</w:t>
+        <w:t>A4. Hito 1 – Núcleo en staging – destraba el 25%</w:t>
       </w:r>
     </w:p>
     <w:p>
@@ -1337,7 +1236,7 @@
         <w:rPr>
           <w:b w:val="0"/>
         </w:rPr>
-        <w:t>Fecha objetivo: __________</w:t>
+        <w:t>Fecha objetivo: [________]</w:t>
       </w:r>
     </w:p>
     <w:tbl>
@@ -1492,7 +1391,7 @@
         <w:rPr>
           <w:b w:val="0"/>
         </w:rPr>
-        <w:t>Se destraba solo con acta Hito 1 firmada. Firma: ______</w:t>
+        <w:t>Se destraba únicamente con el acta Hito 1 firmada. Firma: [________]</w:t>
       </w:r>
     </w:p>
     <w:p>
@@ -1503,7 +1402,7 @@
         <w:rPr>
           <w:b w:val="0"/>
         </w:rPr>
-        <w:t>A5. Hito 2 – Puesta en producción + hipercare – destraba 25% final</w:t>
+        <w:t>A5. Hito 2 – Puesta en producción + hipercare – destraba el 25% final</w:t>
       </w:r>
     </w:p>
     <w:p>
@@ -1511,7 +1410,7 @@
         <w:rPr>
           <w:b w:val="0"/>
         </w:rPr>
-        <w:t>Fecha objetivo: __________</w:t>
+        <w:t>Fecha objetivo: [________]</w:t>
       </w:r>
     </w:p>
     <w:tbl>
@@ -1563,7 +1462,7 @@
           </w:tcPr>
           <w:p>
             <w:r>
-              <w:t>Anexo B fiscal cerrado con tu contador + prueba OK</w:t>
+              <w:t>Anexo B fiscal cerrado con el contador del LOCATARIO + prueba OK</w:t>
             </w:r>
           </w:p>
         </w:tc>
@@ -1607,7 +1506,7 @@
           </w:tcPr>
           <w:p>
             <w:r>
-              <w:t>Compras + inventario operativos</w:t>
+              <w:t>Compras e inventario operativos</w:t>
             </w:r>
           </w:p>
         </w:tc>
@@ -1629,7 +1528,7 @@
           </w:tcPr>
           <w:p>
             <w:r>
-              <w:t>Capacitación 6h dictada __________ o plan remanente firmado</w:t>
+              <w:t>Capacitación 6h dictada el [________] o plan remanente firmado</w:t>
             </w:r>
           </w:p>
         </w:tc>
@@ -1651,7 +1550,7 @@
           </w:tcPr>
           <w:p>
             <w:r>
-              <w:t>Infra revisada (copia de seguridad, accesos)</w:t>
+              <w:t>Infraestructura revisada (copia de seguridad, accesos)</w:t>
             </w:r>
           </w:p>
         </w:tc>
@@ -1673,7 +1572,7 @@
           </w:tcPr>
           <w:p>
             <w:r>
-              <w:t>Inicio hipercare 10 días hábiles desde __________ hasta __________</w:t>
+              <w:t>Inicio hipercare 10 días hábiles desde el [________] hasta el [________]</w:t>
             </w:r>
           </w:p>
         </w:tc>
@@ -1685,7 +1584,7 @@
         <w:rPr>
           <w:b w:val="0"/>
         </w:rPr>
-        <w:t>Firma cliente: ______    Firma prestador: ______</w:t>
+        <w:t>Firma LOCATARIO: [________] Firma LOCADOR: [________]</w:t>
       </w:r>
     </w:p>
     <w:p>
@@ -1710,13 +1609,13 @@
         <w:rPr>
           <w:b w:val="0"/>
         </w:rPr>
-        <w:t>En __________, a los __________, MODOOPS y __________ dejan constancia:</w:t>
+        <w:t>En [________], a los [________] días del mes de [________] de 2026, EL LOCADOR y EL LOCATARIO dejan constancia:</w:t>
         <w:br/>
-        <w:t>1. Hito 1 cumplido según checklist A4. Fallas menores pendientes (si no hay, "ninguna"): __________</w:t>
+        <w:t>1. Hito 1 cumplido según checklist A4. Fallas menores pendientes (si no hay, "ninguna"): [________].</w:t>
         <w:br/>
-        <w:t>2. Con esta firma EL CLIENTE acepta el núcleo en staging.</w:t>
+        <w:t>2. Con la presente firma, EL LOCATARIO acepta el núcleo en staging.</w:t>
         <w:br/>
-        <w:t xml:space="preserve">3. Se habilita facturación del 25%: [$200 USD – ARS equiv. TC __________], a cuenta Alias </w:t>
+        <w:t xml:space="preserve">3. Se habilita facturación del 25%: [$200 USD – ARS equivalente Tipo de Cambio [________]], a cuenta Alias </w:t>
       </w:r>
       <w:r>
         <w:rPr>
@@ -1740,7 +1639,7 @@
         <w:rPr>
           <w:b w:val="0"/>
         </w:rPr>
-        <w:t>, contra Factura C N° __________.</w:t>
+        <w:t>, contra Factura C N° [________].</w:t>
         <w:br/>
         <w:t>4. Todo destrabe requiere firma (v2: sin silencio=aceptación).</w:t>
       </w:r>
@@ -1788,13 +1687,13 @@
         <w:rPr>
           <w:b w:val="0"/>
         </w:rPr>
-        <w:t>En __________, a los __________, MODOOPS y __________ dejan constancia:</w:t>
+        <w:t>En [________], a los [________] días del mes de [________] de 2026, EL LOCADOR y EL LOCATARIO dejan constancia:</w:t>
         <w:br/>
-        <w:t>1. Hito 2 cumplido según checklist A5. Fallas menores pendientes (si no hay, "ninguna"): __________</w:t>
+        <w:t>1. Hito 2 cumplido según checklist A5. Fallas menores pendientes (si no hay, "ninguna"): [________].</w:t>
         <w:br/>
-        <w:t>2. Con esta firma EL CLIENTE acepta el sistema en producción e inicia hipercare hasta __________.</w:t>
+        <w:t>2. Con la presente firma, EL LOCATARIO acepta el sistema en producción e inicia el período de hipercare hasta el [________].</w:t>
         <w:br/>
-        <w:t xml:space="preserve">3. Se habilita facturación del 25% final: [$200 USD – ARS equiv. TC __________], a cuenta Alias </w:t>
+        <w:t xml:space="preserve">3. Se habilita facturación del 25% final: [$200 USD – ARS equivalente Tipo de Cambio [________]], a cuenta Alias </w:t>
       </w:r>
       <w:r>
         <w:rPr>
@@ -1818,11 +1717,11 @@
         <w:rPr>
           <w:b w:val="0"/>
         </w:rPr>
-        <w:t>, contra Factura C N° __________.</w:t>
+        <w:t>, contra Factura C N° [________].</w:t>
         <w:br/>
-        <w:t>4. Desde __________ rige mes de acompañamiento, desde __________ abono mensual $50 USD con vencimiento 1 al 10 según cláusula 9.</w:t>
+        <w:t>4. Desde el [________] rige el mes de acompañamiento, y desde el [________] corre el abono mensual de $50 USD con vencimiento del 1 al 10 según la cláusula 9.</w:t>
         <w:br/>
-        <w:t>5. Pendientes fuera de alcance: __________ se presupuestan aparte, no frenan pago.</w:t>
+        <w:t>5. Pendientes fuera de alcance: [________] se presupuestan aparte, no frenan el pago.</w:t>
         <w:br/>
         <w:t>6. Todo destrabe requiere firma (v2: sin silencio=aceptación).</w:t>
       </w:r>
@@ -1861,7 +1760,537 @@
         <w:rPr>
           <w:b w:val="0"/>
         </w:rPr>
-        <w:t>Enviar por WhatsApp + email el día de cada hito, pedir foto firmada o firma digital.</w:t>
+        <w:t>(Instrucción operativa: Enviar por WhatsApp + email el día de cada hito, pedir foto firmada o firma digital)</w:t>
+      </w:r>
+    </w:p>
+    <w:p>
+      <w:r>
+        <w:br w:type="page"/>
+      </w:r>
+    </w:p>
+    <w:p>
+      <w:pPr>
+        <w:pStyle w:val="Heading1"/>
+        <w:jc w:val="center"/>
+      </w:pPr>
+      <w:r>
+        <w:rPr>
+          <w:b w:val="0"/>
+        </w:rPr>
+        <w:t>ANEXO B – CONFIGURACIÓN FISCAL Y FACTURACIÓN ELECTRÓNICA</w:t>
+      </w:r>
+    </w:p>
+    <w:p>
+      <w:pPr>
+        <w:jc w:val="center"/>
+      </w:pPr>
+      <w:r>
+        <w:rPr>
+          <w:b w:val="0"/>
+        </w:rPr>
+        <w:t>Forma parte integral del contrato firmado – LOCATARIO: [________] Fecha de cierre de Anexo: [________]Este anexo debe estar completo y firmado previo al Go-Live (Hito 2).</w:t>
+      </w:r>
+    </w:p>
+    <w:p>
+      <w:pPr>
+        <w:pStyle w:val="Heading3"/>
+      </w:pPr>
+      <w:r>
+        <w:rPr>
+          <w:b w:val="0"/>
+        </w:rPr>
+        <w:t>B1. Datos Fiscales del LOCATARIO (Titular del sistema)</w:t>
+      </w:r>
+    </w:p>
+    <w:p>
+      <w:pPr>
+        <w:pStyle w:val="ListBullet"/>
+      </w:pPr>
+      <w:r>
+        <w:rPr>
+          <w:b w:val="0"/>
+        </w:rPr>
+        <w:t>Razón Social / Nombre: [________]</w:t>
+      </w:r>
+    </w:p>
+    <w:p>
+      <w:pPr>
+        <w:pStyle w:val="ListBullet"/>
+      </w:pPr>
+      <w:r>
+        <w:rPr>
+          <w:b w:val="0"/>
+        </w:rPr>
+        <w:t>CUIT: [________]</w:t>
+      </w:r>
+    </w:p>
+    <w:p>
+      <w:pPr>
+        <w:pStyle w:val="ListBullet"/>
+      </w:pPr>
+      <w:r>
+        <w:rPr>
+          <w:b w:val="0"/>
+        </w:rPr>
+        <w:t>Condición frente al IVA: [ Responsable Inscripto / Monotributo / Exento ]</w:t>
+      </w:r>
+    </w:p>
+    <w:p>
+      <w:pPr>
+        <w:pStyle w:val="ListBullet"/>
+      </w:pPr>
+      <w:r>
+        <w:rPr>
+          <w:b w:val="0"/>
+        </w:rPr>
+        <w:t>Ingresos Brutos (Jurisdicción / N° de Padrón): [________]</w:t>
+      </w:r>
+    </w:p>
+    <w:p>
+      <w:pPr>
+        <w:pStyle w:val="ListBullet"/>
+      </w:pPr>
+      <w:r>
+        <w:rPr>
+          <w:b w:val="0"/>
+        </w:rPr>
+        <w:t>Inicio de Actividades: [________]</w:t>
+      </w:r>
+    </w:p>
+    <w:p>
+      <w:pPr>
+        <w:pStyle w:val="Heading3"/>
+      </w:pPr>
+      <w:r>
+        <w:rPr>
+          <w:b w:val="0"/>
+        </w:rPr>
+        <w:t>B2. Puntos de Venta (AFIP)</w:t>
+      </w:r>
+    </w:p>
+    <w:p>
+      <w:r>
+        <w:rPr>
+          <w:b w:val="0"/>
+        </w:rPr>
+        <w:t>Se configurarán exclusivamente los siguientes Puntos de Venta (PV) creados en AFIP bajo la modalidad "Web Service":</w:t>
+      </w:r>
+    </w:p>
+    <w:p>
+      <w:pPr>
+        <w:pStyle w:val="ListBullet"/>
+      </w:pPr>
+      <w:r>
+        <w:rPr>
+          <w:b w:val="0"/>
+        </w:rPr>
+        <w:t>PV N°: [________] – Destino/Caja: [________]</w:t>
+      </w:r>
+    </w:p>
+    <w:p>
+      <w:pPr>
+        <w:pStyle w:val="ListBullet"/>
+      </w:pPr>
+      <w:r>
+        <w:rPr>
+          <w:b w:val="0"/>
+        </w:rPr>
+        <w:t>PV N°: [________] – Destino/Caja: [________]</w:t>
+      </w:r>
+    </w:p>
+    <w:p>
+      <w:pPr>
+        <w:jc w:val="center"/>
+      </w:pPr>
+      <w:r>
+        <w:rPr>
+          <w:b w:val="0"/>
+        </w:rPr>
+        <w:t>(Nota: La creación de estos PV en el portal de AFIP es responsabilidad exclusiva del LOCATARIO / su contador).</w:t>
+      </w:r>
+    </w:p>
+    <w:p>
+      <w:pPr>
+        <w:pStyle w:val="Heading3"/>
+      </w:pPr>
+      <w:r>
+        <w:rPr>
+          <w:b w:val="0"/>
+        </w:rPr>
+        <w:t>B3. Comprobantes Electrónicos Habilitados (Lista Cerrada)</w:t>
+      </w:r>
+    </w:p>
+    <w:p>
+      <w:r>
+        <w:rPr>
+          <w:b w:val="0"/>
+        </w:rPr>
+        <w:t>El sistema se configurará para emitir de forma estándar los siguientes comprobantes. Cualquier comprobante no marcado aquí se considera fuera de alcance y se cotizará como Add-on.</w:t>
+      </w:r>
+    </w:p>
+    <w:tbl>
+      <w:tblPr>
+        <w:tblStyle w:val="TableGrid"/>
+        <w:tblW w:type="auto" w:w="0"/>
+        <w:tblLook w:firstColumn="1" w:firstRow="1" w:lastColumn="0" w:lastRow="0" w:noHBand="0" w:noVBand="1" w:val="04A0"/>
+      </w:tblPr>
+      <w:tblGrid>
+        <w:gridCol w:w="4320"/>
+        <w:gridCol w:w="4320"/>
+      </w:tblGrid>
+      <w:tr>
+        <w:tc>
+          <w:tcPr>
+            <w:tcW w:type="dxa" w:w="4320"/>
+          </w:tcPr>
+          <w:p>
+            <w:r>
+              <w:t>☐</w:t>
+            </w:r>
+          </w:p>
+        </w:tc>
+        <w:tc>
+          <w:tcPr>
+            <w:tcW w:type="dxa" w:w="4320"/>
+          </w:tcPr>
+          <w:p>
+            <w:r>
+              <w:t>Facturas y Notas de Crédito/Débito tipo "A"</w:t>
+            </w:r>
+          </w:p>
+        </w:tc>
+      </w:tr>
+      <w:tr>
+        <w:tc>
+          <w:tcPr>
+            <w:tcW w:type="dxa" w:w="4320"/>
+          </w:tcPr>
+          <w:p>
+            <w:r>
+              <w:t>☐</w:t>
+            </w:r>
+          </w:p>
+        </w:tc>
+        <w:tc>
+          <w:tcPr>
+            <w:tcW w:type="dxa" w:w="4320"/>
+          </w:tcPr>
+          <w:p>
+            <w:r>
+              <w:t>Facturas y Notas de Crédito/Débito tipo "B"</w:t>
+            </w:r>
+          </w:p>
+        </w:tc>
+      </w:tr>
+      <w:tr>
+        <w:tc>
+          <w:tcPr>
+            <w:tcW w:type="dxa" w:w="4320"/>
+          </w:tcPr>
+          <w:p>
+            <w:r>
+              <w:t>☐</w:t>
+            </w:r>
+          </w:p>
+        </w:tc>
+        <w:tc>
+          <w:tcPr>
+            <w:tcW w:type="dxa" w:w="4320"/>
+          </w:tcPr>
+          <w:p>
+            <w:r>
+              <w:t>Facturas y Notas de Crédito/Débito tipo "C"</w:t>
+            </w:r>
+          </w:p>
+        </w:tc>
+      </w:tr>
+      <w:tr>
+        <w:tc>
+          <w:tcPr>
+            <w:tcW w:type="dxa" w:w="4320"/>
+          </w:tcPr>
+          <w:p>
+            <w:r>
+              <w:t>☐</w:t>
+            </w:r>
+          </w:p>
+        </w:tc>
+        <w:tc>
+          <w:tcPr>
+            <w:tcW w:type="dxa" w:w="4320"/>
+          </w:tcPr>
+          <w:p>
+            <w:r>
+              <w:t>Facturas y Notas de Crédito/Débito tipo "M"</w:t>
+            </w:r>
+          </w:p>
+        </w:tc>
+      </w:tr>
+      <w:tr>
+        <w:tc>
+          <w:tcPr>
+            <w:tcW w:type="dxa" w:w="4320"/>
+          </w:tcPr>
+          <w:p>
+            <w:r>
+              <w:t>☐</w:t>
+            </w:r>
+          </w:p>
+        </w:tc>
+        <w:tc>
+          <w:tcPr>
+            <w:tcW w:type="dxa" w:w="4320"/>
+          </w:tcPr>
+          <w:p>
+            <w:r>
+              <w:t>Remitos X (Uso interno / No fiscales)</w:t>
+            </w:r>
+          </w:p>
+        </w:tc>
+      </w:tr>
+      <w:tr>
+        <w:tc>
+          <w:tcPr>
+            <w:tcW w:type="dxa" w:w="4320"/>
+          </w:tcPr>
+          <w:p>
+            <w:r>
+              <w:t>☐</w:t>
+            </w:r>
+          </w:p>
+        </w:tc>
+        <w:tc>
+          <w:tcPr>
+            <w:tcW w:type="dxa" w:w="4320"/>
+          </w:tcPr>
+          <w:p>
+            <w:r>
+              <w:t>Otros (Especificar, sujeto a factibilidad técnica): [________]</w:t>
+            </w:r>
+          </w:p>
+        </w:tc>
+      </w:tr>
+    </w:tbl>
+    <w:p/>
+    <w:p>
+      <w:pPr>
+        <w:pStyle w:val="Heading3"/>
+      </w:pPr>
+      <w:r>
+        <w:rPr>
+          <w:b w:val="0"/>
+        </w:rPr>
+        <w:t>B4. Certificados Digitales y Delegación</w:t>
+      </w:r>
+    </w:p>
+    <w:p>
+      <w:r>
+        <w:rPr>
+          <w:b w:val="0"/>
+        </w:rPr>
+        <w:t>EL LOCATARIO (a través de su contador) se compromete a:</w:t>
+      </w:r>
+    </w:p>
+    <w:p>
+      <w:pPr>
+        <w:pStyle w:val="ListBullet"/>
+      </w:pPr>
+      <w:r>
+        <w:rPr>
+          <w:b w:val="0"/>
+        </w:rPr>
+        <w:t>1. Delegar el servicio "Facturación Electrónica" al alias/computador fiscal provisto por EL LOCADOR.</w:t>
+      </w:r>
+    </w:p>
+    <w:p>
+      <w:pPr>
+        <w:pStyle w:val="ListBullet"/>
+      </w:pPr>
+      <w:r>
+        <w:rPr>
+          <w:b w:val="0"/>
+        </w:rPr>
+        <w:t>2. Proveer el Certificado Digital (CSR/CRT) vigente y la contraseña asociada, o en su defecto, autorizar a EL LOCADOR a generarlo mediante delegación en AFIP.</w:t>
+      </w:r>
+    </w:p>
+    <w:p>
+      <w:pPr>
+        <w:pStyle w:val="ListBullet"/>
+      </w:pPr>
+      <w:r>
+        <w:rPr>
+          <w:b w:val="0"/>
+        </w:rPr>
+        <w:t>Fecha de emisión del Certificado: [________]</w:t>
+      </w:r>
+    </w:p>
+    <w:p>
+      <w:pPr>
+        <w:pStyle w:val="ListBullet"/>
+      </w:pPr>
+      <w:r>
+        <w:rPr>
+          <w:b w:val="0"/>
+        </w:rPr>
+        <w:t>Fecha de vencimiento del Certificado: [________]</w:t>
+      </w:r>
+    </w:p>
+    <w:p>
+      <w:pPr>
+        <w:jc w:val="center"/>
+      </w:pPr>
+      <w:r>
+        <w:rPr>
+          <w:b w:val="0"/>
+        </w:rPr>
+        <w:t>(El LOCADOR no se responsabiliza por la caducidad del certificado digital una vez en producción, siendo obligación del LOCATARIO su renovación anual).</w:t>
+      </w:r>
+    </w:p>
+    <w:p>
+      <w:pPr>
+        <w:pStyle w:val="Heading3"/>
+      </w:pPr>
+      <w:r>
+        <w:rPr>
+          <w:b w:val="0"/>
+        </w:rPr>
+        <w:t>B5. Impuestos, Retenciones y Percepciones</w:t>
+      </w:r>
+    </w:p>
+    <w:p>
+      <w:r>
+        <w:rPr>
+          <w:b w:val="0"/>
+        </w:rPr>
+        <w:t>Se configurarán las siguientes alícuotas estándar de IVA: [ 21% / 10,5% / 27% / Exento / No Gravado ].</w:t>
+      </w:r>
+    </w:p>
+    <w:p>
+      <w:r>
+        <w:rPr>
+          <w:b w:val="0"/>
+        </w:rPr>
+        <w:t>Régimen de Retenciones/Percepciones (IIBB, IVA, Ganancias):</w:t>
+      </w:r>
+    </w:p>
+    <w:tbl>
+      <w:tblPr>
+        <w:tblStyle w:val="TableGrid"/>
+        <w:tblW w:type="auto" w:w="0"/>
+        <w:tblLook w:firstColumn="1" w:firstRow="1" w:lastColumn="0" w:lastRow="0" w:noHBand="0" w:noVBand="1" w:val="04A0"/>
+      </w:tblPr>
+      <w:tblGrid>
+        <w:gridCol w:w="4320"/>
+        <w:gridCol w:w="4320"/>
+      </w:tblGrid>
+      <w:tr>
+        <w:tc>
+          <w:tcPr>
+            <w:tcW w:type="dxa" w:w="4320"/>
+          </w:tcPr>
+          <w:p>
+            <w:r>
+              <w:t>☐</w:t>
+            </w:r>
+          </w:p>
+        </w:tc>
+        <w:tc>
+          <w:tcPr>
+            <w:tcW w:type="dxa" w:w="4320"/>
+          </w:tcPr>
+          <w:p>
+            <w:r>
+              <w:t>No aplica / No es Agente de Recaudación.</w:t>
+            </w:r>
+          </w:p>
+        </w:tc>
+      </w:tr>
+      <w:tr>
+        <w:tc>
+          <w:tcPr>
+            <w:tcW w:type="dxa" w:w="4320"/>
+          </w:tcPr>
+          <w:p>
+            <w:r>
+              <w:t>☐</w:t>
+            </w:r>
+          </w:p>
+        </w:tc>
+        <w:tc>
+          <w:tcPr>
+            <w:tcW w:type="dxa" w:w="4320"/>
+          </w:tcPr>
+          <w:p>
+            <w:r>
+              <w:t>Sí aplica. Se incluye configuración básica estándar detallada a continuación: [________]</w:t>
+            </w:r>
+          </w:p>
+        </w:tc>
+      </w:tr>
+    </w:tbl>
+    <w:p/>
+    <w:p>
+      <w:pPr>
+        <w:jc w:val="center"/>
+      </w:pPr>
+      <w:r>
+        <w:rPr>
+          <w:b w:val="0"/>
+        </w:rPr>
+        <w:t>(Aclaración: regímenes complejos de padrones automatizados quedan excluidos salvo cotización Add-on).</w:t>
+      </w:r>
+    </w:p>
+    <w:p>
+      <w:pPr>
+        <w:pStyle w:val="Heading3"/>
+      </w:pPr>
+      <w:r>
+        <w:rPr>
+          <w:b w:val="0"/>
+        </w:rPr>
+        <w:t>B6. Conformidad de Prueba</w:t>
+      </w:r>
+    </w:p>
+    <w:p>
+      <w:r>
+        <w:rPr>
+          <w:b w:val="0"/>
+        </w:rPr>
+        <w:t>Las partes declaran que se han realizado pruebas de conectividad y emisión de comprobantes en el ambiente de Homologación (Staging) de AFIP con resultado exitoso, autorizando el pase a Producción para el Go-Live.</w:t>
+      </w:r>
+    </w:p>
+    <w:tbl>
+      <w:tblPr>
+        <w:tblStyle w:val="TableGrid"/>
+        <w:tblW w:type="auto" w:w="0"/>
+        <w:tblLook w:firstColumn="1" w:firstRow="1" w:lastColumn="0" w:lastRow="0" w:noHBand="0" w:noVBand="1" w:val="04A0"/>
+      </w:tblPr>
+      <w:tblGrid>
+        <w:gridCol w:w="4320"/>
+        <w:gridCol w:w="4320"/>
+      </w:tblGrid>
+      <w:tr>
+        <w:tc>
+          <w:tcPr>
+            <w:tcW w:type="dxa" w:w="4320"/>
+          </w:tcPr>
+          <w:p/>
+        </w:tc>
+        <w:tc>
+          <w:tcPr>
+            <w:tcW w:type="dxa" w:w="4320"/>
+          </w:tcPr>
+          <w:p/>
+        </w:tc>
+      </w:tr>
+    </w:tbl>
+    <w:p/>
+    <w:p>
+      <w:r>
+        <w:rPr>
+          <w:b w:val="0"/>
+        </w:rPr>
+        <w:t>Firma Contador (Opcional pero recomendada): [________]</w:t>
       </w:r>
     </w:p>
     <w:sectPr>

</xml_diff>

<commit_message>
fix(contrato): 4.1/4.2/4.5 apuntan a Anexo B (unifica fiscal)
</commit_message>
<xml_diff>
--- a/docs/contrato-modoops.docx
+++ b/docs/contrato-modoops.docx
@@ -396,7 +396,7 @@
         <w:rPr>
           <w:b w:val="0"/>
         </w:rPr>
-        <w:t>4.1. El ancla no promete comprobantes salvo la lista explícita del Anexo A, que se cierra durante la implementación antes del go-live.</w:t>
+        <w:t>4.1. El ancla no promete comprobantes salvo la lista explícita del Anexo B, que se cierra durante la implementación antes del go-live.</w:t>
       </w:r>
     </w:p>
     <w:p>
@@ -407,7 +407,7 @@
         <w:rPr>
           <w:b w:val="0"/>
         </w:rPr>
-        <w:t>4.2. Sin Anexo A firmado y prueba en staging, no hay puesta en producción ni emisión real.</w:t>
+        <w:t>4.2. Sin Anexo B firmado + prueba en staging no hay puesta en producción ni emisión real.</w:t>
       </w:r>
     </w:p>
     <w:p>
@@ -440,7 +440,7 @@
         <w:rPr>
           <w:b w:val="0"/>
         </w:rPr>
-        <w:t>4.5. Devoluciones y notas de crédito quedan fuera del ancla salvo lista explícita en el Anexo A.</w:t>
+        <w:t>4.5. Devoluciones y notas de crédito quedan fuera del ancla salvo lista explícita en el Anexo B.</w:t>
       </w:r>
     </w:p>
     <w:p>

</xml_diff>